<commit_message>
docs: add SCIN data section to paper and journal entry
Add append-only docx helper so drafts edited in Word are never rewritten.
Thesis section 5.1 update script included; pending while the file is open.
</commit_message>
<xml_diff>
--- a/docs/Paper_Introduction.docx
+++ b/docs/Paper_Introduction.docx
@@ -112,6 +112,384 @@
       </w:pPr>
       <w:r>
         <w:t>To answer them, we combine a transfer-learned image encoder with a late-fusion questionnaire branch trained with modality dropout. We evaluate it on SCIN [CITE], with DDI [CITE] and Fitzpatrick17k [CITE] as additional sources, and report results stratified by skin tone. We also use Grad-CAM [CITE] to inspect which image regions drive predictions. [Contributions to be finalized once results are available.]</w:t>
+      </w:r>
+    </w:p>
+    <w:p>
+      <w:pPr>
+        <w:pStyle w:val="Heading1"/>
+      </w:pPr>
+      <w:r>
+        <w:t>3. Data (draft)</w:t>
+      </w:r>
+    </w:p>
+    <w:p>
+      <w:pPr>
+        <w:pStyle w:val="Heading2"/>
+      </w:pPr>
+      <w:r>
+        <w:t>3.1 SCIN dataset and audit</w:t>
+      </w:r>
+    </w:p>
+    <w:p>
+      <w:pPr>
+        <w:ind w:firstLine="709"/>
+        <w:jc w:val="both"/>
+      </w:pPr>
+      <w:r>
+        <w:t>We use SCIN (Skin Condition Image Network) release 1.0.0 [1] (https://github.com/google-research-datasets/scin), a crowdsourced dataset of smartphone photographs contributed by US users together with self-reported symptoms, texture, duration and demographics. Case-level metadata are distributed as scin_cases.csv and scin_labels.csv, joined on case_id [3]. SCIN is released under the SCIN Data Use License [2] (https://github.com/google-research-datasets/scin/blob/main/LICENSE), which permits sharing and adaptation with attribution and prohibits any attempt to re-identify data subjects; we use the data for research only and do not redistribute images.</w:t>
+      </w:r>
+    </w:p>
+    <w:p>
+      <w:pPr>
+        <w:ind w:firstLine="709"/>
+        <w:jc w:val="both"/>
+      </w:pPr>
+      <w:r>
+        <w:t>We audited the metadata with a reproducible script (ml/scripts/audit_scin.py) before any modelling. The dataset contains 5,033 unique cases and 10,407 images (mean 2.07 per case; 38.7% of cases have one image, 15.8% two and 45.5% three); every case_id appears exactly once in both files. Multi-select questions are encoded as one YES/blank column per option, so a blank cell means an unticked option rather than a missing value; we therefore measure missingness per question. Uninformative answers (e.g. AGE_UNKNOWN, OTHER_OR_UNSPECIFIED) are counted separately from absent values.</w:t>
+      </w:r>
+    </w:p>
+    <w:p>
+      <w:pPr>
+        <w:ind w:firstLine="709"/>
+        <w:jc w:val="both"/>
+      </w:pPr>
+      <w:r>
+        <w:t>Natural missingness is high and uneven across fields: age group is unknown for 56.9% of cases, self-reported Fitzpatrick type is absent or unidentified for 56.8%, the race/ethnicity question is unanswered for 47.3%, condition symptoms for 25.1%, duration for 20.6%, and texture and body location for about 19%. Real users thus leave a large share of questionnaire items empty, which motivates RQ2.</w:t>
+      </w:r>
+    </w:p>
+    <w:p>
+      <w:r>
+        <w:rPr>
+          <w:i/>
+        </w:rPr>
+        <w:t>Table 1. Estimated skin-tone distribution in SCIN (N = 5,033 cases).</w:t>
+      </w:r>
+    </w:p>
+    <w:tbl>
+      <w:tblPr>
+        <w:tblStyle w:val="TableGrid"/>
+        <w:tblW w:type="auto" w:w="0"/>
+        <w:tblLook w:firstColumn="1" w:firstRow="1" w:lastColumn="0" w:lastRow="0" w:noHBand="0" w:noVBand="1" w:val="04A0"/>
+      </w:tblPr>
+      <w:tblGrid>
+        <w:gridCol w:w="3135"/>
+        <w:gridCol w:w="3135"/>
+        <w:gridCol w:w="3135"/>
+      </w:tblGrid>
+      <w:tr>
+        <w:tc>
+          <w:tcPr>
+            <w:tcW w:type="dxa" w:w="3135"/>
+          </w:tcPr>
+          <w:p>
+            <w:r>
+              <w:rPr>
+                <w:b/>
+              </w:rPr>
+              <w:t>Group</w:t>
+            </w:r>
+          </w:p>
+        </w:tc>
+        <w:tc>
+          <w:tcPr>
+            <w:tcW w:type="dxa" w:w="3135"/>
+          </w:tcPr>
+          <w:p>
+            <w:r>
+              <w:rPr>
+                <w:b/>
+              </w:rPr>
+              <w:t>Cases</w:t>
+            </w:r>
+          </w:p>
+        </w:tc>
+        <w:tc>
+          <w:tcPr>
+            <w:tcW w:type="dxa" w:w="3135"/>
+          </w:tcPr>
+          <w:p>
+            <w:r>
+              <w:rPr>
+                <w:b/>
+              </w:rPr>
+              <w:t>%</w:t>
+            </w:r>
+          </w:p>
+        </w:tc>
+      </w:tr>
+      <w:tr>
+        <w:tc>
+          <w:tcPr>
+            <w:tcW w:type="dxa" w:w="3135"/>
+          </w:tcPr>
+          <w:p>
+            <w:r>
+              <w:t>eFST I–II</w:t>
+            </w:r>
+          </w:p>
+        </w:tc>
+        <w:tc>
+          <w:tcPr>
+            <w:tcW w:type="dxa" w:w="3135"/>
+          </w:tcPr>
+          <w:p>
+            <w:r>
+              <w:t>1,773</w:t>
+            </w:r>
+          </w:p>
+        </w:tc>
+        <w:tc>
+          <w:tcPr>
+            <w:tcW w:type="dxa" w:w="3135"/>
+          </w:tcPr>
+          <w:p>
+            <w:r>
+              <w:t>35.2</w:t>
+            </w:r>
+          </w:p>
+        </w:tc>
+      </w:tr>
+      <w:tr>
+        <w:tc>
+          <w:tcPr>
+            <w:tcW w:type="dxa" w:w="3135"/>
+          </w:tcPr>
+          <w:p>
+            <w:r>
+              <w:t>eFST III–IV</w:t>
+            </w:r>
+          </w:p>
+        </w:tc>
+        <w:tc>
+          <w:tcPr>
+            <w:tcW w:type="dxa" w:w="3135"/>
+          </w:tcPr>
+          <w:p>
+            <w:r>
+              <w:t>2,161</w:t>
+            </w:r>
+          </w:p>
+        </w:tc>
+        <w:tc>
+          <w:tcPr>
+            <w:tcW w:type="dxa" w:w="3135"/>
+          </w:tcPr>
+          <w:p>
+            <w:r>
+              <w:t>42.9</w:t>
+            </w:r>
+          </w:p>
+        </w:tc>
+      </w:tr>
+      <w:tr>
+        <w:tc>
+          <w:tcPr>
+            <w:tcW w:type="dxa" w:w="3135"/>
+          </w:tcPr>
+          <w:p>
+            <w:r>
+              <w:t>eFST V–VI</w:t>
+            </w:r>
+          </w:p>
+        </w:tc>
+        <w:tc>
+          <w:tcPr>
+            <w:tcW w:type="dxa" w:w="3135"/>
+          </w:tcPr>
+          <w:p>
+            <w:r>
+              <w:t>436</w:t>
+            </w:r>
+          </w:p>
+        </w:tc>
+        <w:tc>
+          <w:tcPr>
+            <w:tcW w:type="dxa" w:w="3135"/>
+          </w:tcPr>
+          <w:p>
+            <w:r>
+              <w:t>8.7</w:t>
+            </w:r>
+          </w:p>
+        </w:tc>
+      </w:tr>
+      <w:tr>
+        <w:tc>
+          <w:tcPr>
+            <w:tcW w:type="dxa" w:w="3135"/>
+          </w:tcPr>
+          <w:p>
+            <w:r>
+              <w:t>eFST missing</w:t>
+            </w:r>
+          </w:p>
+        </w:tc>
+        <w:tc>
+          <w:tcPr>
+            <w:tcW w:type="dxa" w:w="3135"/>
+          </w:tcPr>
+          <w:p>
+            <w:r>
+              <w:t>663</w:t>
+            </w:r>
+          </w:p>
+        </w:tc>
+        <w:tc>
+          <w:tcPr>
+            <w:tcW w:type="dxa" w:w="3135"/>
+          </w:tcPr>
+          <w:p>
+            <w:r>
+              <w:t>13.2</w:t>
+            </w:r>
+          </w:p>
+        </w:tc>
+      </w:tr>
+      <w:tr>
+        <w:tc>
+          <w:tcPr>
+            <w:tcW w:type="dxa" w:w="3135"/>
+          </w:tcPr>
+          <w:p>
+            <w:r>
+              <w:t>eMST 1–3 (US annotators)</w:t>
+            </w:r>
+          </w:p>
+        </w:tc>
+        <w:tc>
+          <w:tcPr>
+            <w:tcW w:type="dxa" w:w="3135"/>
+          </w:tcPr>
+          <w:p>
+            <w:r>
+              <w:t>3,502</w:t>
+            </w:r>
+          </w:p>
+        </w:tc>
+        <w:tc>
+          <w:tcPr>
+            <w:tcW w:type="dxa" w:w="3135"/>
+          </w:tcPr>
+          <w:p>
+            <w:r>
+              <w:t>69.6</w:t>
+            </w:r>
+          </w:p>
+        </w:tc>
+      </w:tr>
+      <w:tr>
+        <w:tc>
+          <w:tcPr>
+            <w:tcW w:type="dxa" w:w="3135"/>
+          </w:tcPr>
+          <w:p>
+            <w:r>
+              <w:t>eMST 4–6 (US annotators)</w:t>
+            </w:r>
+          </w:p>
+        </w:tc>
+        <w:tc>
+          <w:tcPr>
+            <w:tcW w:type="dxa" w:w="3135"/>
+          </w:tcPr>
+          <w:p>
+            <w:r>
+              <w:t>1,296</w:t>
+            </w:r>
+          </w:p>
+        </w:tc>
+        <w:tc>
+          <w:tcPr>
+            <w:tcW w:type="dxa" w:w="3135"/>
+          </w:tcPr>
+          <w:p>
+            <w:r>
+              <w:t>25.8</w:t>
+            </w:r>
+          </w:p>
+        </w:tc>
+      </w:tr>
+      <w:tr>
+        <w:tc>
+          <w:tcPr>
+            <w:tcW w:type="dxa" w:w="3135"/>
+          </w:tcPr>
+          <w:p>
+            <w:r>
+              <w:t>eMST 7–10 (US annotators)</w:t>
+            </w:r>
+          </w:p>
+        </w:tc>
+        <w:tc>
+          <w:tcPr>
+            <w:tcW w:type="dxa" w:w="3135"/>
+          </w:tcPr>
+          <w:p>
+            <w:r>
+              <w:t>207</w:t>
+            </w:r>
+          </w:p>
+        </w:tc>
+        <w:tc>
+          <w:tcPr>
+            <w:tcW w:type="dxa" w:w="3135"/>
+          </w:tcPr>
+          <w:p>
+            <w:r>
+              <w:t>4.1</w:t>
+            </w:r>
+          </w:p>
+        </w:tc>
+      </w:tr>
+    </w:tbl>
+    <w:p>
+      <w:pPr>
+        <w:ind w:firstLine="709"/>
+        <w:jc w:val="both"/>
+      </w:pPr>
+      <w:r>
+        <w:t>We define eFST as the median of up to three dermatologist Fitzpatrick labels per case, rounded half up; 73.7% of cases have a single label and 13.2% have none. Darker tones are under-represented (Table 1): eFST V–VI covers 8.7% of cases and type VI only 68 cases (1.35%). On the Monk scale, eMST 7–10 covers 4.1% of cases according to US annotators but only 1.0% according to India annotators, so the annotator pool must be fixed and reported. Estimates for darker groups will carry wide confidence intervals.</w:t>
+      </w:r>
+    </w:p>
+    <w:p>
+      <w:pPr>
+        <w:ind w:firstLine="709"/>
+        <w:jc w:val="both"/>
+      </w:pPr>
+      <w:r>
+        <w:t>Weighted dermatologist condition labels are available for 3,061 cases (60.8%); the first dermatologist rated image quality insufficient for 38.3% of cases. These labels are retrospective differential assessments, not clinically confirmed outcomes, and our metrics therefore measure agreement with dermatologist labels. The most frequent top-weighted labels are eczema (488), allergic contact dermatitis (270), urticaria (214), insect bite (185) and folliculitis (142), while acne (61) and rosacea (29) are rare; these counts will constrain the final class set. All splits are made at the case level so that images of one case never cross splits.</w:t>
+      </w:r>
+    </w:p>
+    <w:p>
+      <w:pPr>
+        <w:pStyle w:val="Heading1"/>
+      </w:pPr>
+      <w:r>
+        <w:t>References</w:t>
+      </w:r>
+    </w:p>
+    <w:p>
+      <w:pPr>
+        <w:ind w:firstLine="0"/>
+      </w:pPr>
+      <w:r>
+        <w:t>[1] Google Research, SCIN: Skin Condition Image Network, GitHub repository. https://github.com/google-research-datasets/scin</w:t>
+      </w:r>
+    </w:p>
+    <w:p>
+      <w:pPr>
+        <w:ind w:firstLine="0"/>
+      </w:pPr>
+      <w:r>
+        <w:t>[2] Google Research, SCIN Data Use License. https://github.com/google-research-datasets/scin/blob/main/LICENSE</w:t>
+      </w:r>
+    </w:p>
+    <w:p>
+      <w:pPr>
+        <w:ind w:firstLine="0"/>
+      </w:pPr>
+      <w:r>
+        <w:t>[3] Google Research, SCIN dataset schema documentation. https://github.com/google-research-datasets/scin/blob/main/dataset_schema.md</w:t>
       </w:r>
     </w:p>
     <w:sectPr>

</xml_diff>

<commit_message>
feat(ml): audit SCIN metadata and licence (Task 1.1)
audit_scin.py, schema and audit report, data source registry; SCIN data sections in the
thesis and the paper.
</commit_message>
<xml_diff>
--- a/docs/Paper_Introduction.docx
+++ b/docs/Paper_Introduction.docx
@@ -112,6 +112,384 @@
       </w:pPr>
       <w:r>
         <w:t>To answer them, we combine a transfer-learned image encoder with a late-fusion questionnaire branch trained with modality dropout. We evaluate it on SCIN [CITE], with DDI [CITE] and Fitzpatrick17k [CITE] as additional sources, and report results stratified by skin tone. We also use Grad-CAM [CITE] to inspect which image regions drive predictions. [Contributions to be finalized once results are available.]</w:t>
+      </w:r>
+    </w:p>
+    <w:p>
+      <w:pPr>
+        <w:pStyle w:val="Heading1"/>
+      </w:pPr>
+      <w:r>
+        <w:t>3. Data (draft)</w:t>
+      </w:r>
+    </w:p>
+    <w:p>
+      <w:pPr>
+        <w:pStyle w:val="Heading2"/>
+      </w:pPr>
+      <w:r>
+        <w:t>3.1 SCIN dataset and audit</w:t>
+      </w:r>
+    </w:p>
+    <w:p>
+      <w:pPr>
+        <w:ind w:firstLine="709"/>
+        <w:jc w:val="both"/>
+      </w:pPr>
+      <w:r>
+        <w:t>We use SCIN (Skin Condition Image Network) release 1.0.0 [1] (https://github.com/google-research-datasets/scin), a crowdsourced dataset of smartphone photographs contributed by US users together with self-reported symptoms, texture, duration and demographics. Case-level metadata are distributed as scin_cases.csv and scin_labels.csv, joined on case_id [3]. SCIN is released under the SCIN Data Use License [2] (https://github.com/google-research-datasets/scin/blob/main/LICENSE), which permits sharing and adaptation with attribution and prohibits any attempt to re-identify data subjects; we use the data for research only and do not redistribute images.</w:t>
+      </w:r>
+    </w:p>
+    <w:p>
+      <w:pPr>
+        <w:ind w:firstLine="709"/>
+        <w:jc w:val="both"/>
+      </w:pPr>
+      <w:r>
+        <w:t>We audited the metadata with a reproducible script (ml/scripts/audit_scin.py) before any modelling. The dataset contains 5,033 unique cases and 10,407 images (mean 2.07 per case; 38.7% of cases have one image, 15.8% two and 45.5% three); every case_id appears exactly once in both files. Multi-select questions are encoded as one YES/blank column per option, so a blank cell means an unticked option rather than a missing value; we therefore measure missingness per question. Uninformative answers (e.g. AGE_UNKNOWN, OTHER_OR_UNSPECIFIED) are counted separately from absent values.</w:t>
+      </w:r>
+    </w:p>
+    <w:p>
+      <w:pPr>
+        <w:ind w:firstLine="709"/>
+        <w:jc w:val="both"/>
+      </w:pPr>
+      <w:r>
+        <w:t>Natural missingness is high and uneven across fields: age group is unknown for 56.9% of cases, self-reported Fitzpatrick type is absent or unidentified for 56.8%, the race/ethnicity question is unanswered for 47.3%, condition symptoms for 25.1%, duration for 20.6%, and texture and body location for about 19%. Real users thus leave a large share of questionnaire items empty, which motivates RQ2.</w:t>
+      </w:r>
+    </w:p>
+    <w:p>
+      <w:r>
+        <w:rPr>
+          <w:i/>
+        </w:rPr>
+        <w:t>Table 1. Estimated skin-tone distribution in SCIN (N = 5,033 cases).</w:t>
+      </w:r>
+    </w:p>
+    <w:tbl>
+      <w:tblPr>
+        <w:tblStyle w:val="TableGrid"/>
+        <w:tblW w:type="auto" w:w="0"/>
+        <w:tblLook w:firstColumn="1" w:firstRow="1" w:lastColumn="0" w:lastRow="0" w:noHBand="0" w:noVBand="1" w:val="04A0"/>
+      </w:tblPr>
+      <w:tblGrid>
+        <w:gridCol w:w="3135"/>
+        <w:gridCol w:w="3135"/>
+        <w:gridCol w:w="3135"/>
+      </w:tblGrid>
+      <w:tr>
+        <w:tc>
+          <w:tcPr>
+            <w:tcW w:type="dxa" w:w="3135"/>
+          </w:tcPr>
+          <w:p>
+            <w:r>
+              <w:rPr>
+                <w:b/>
+              </w:rPr>
+              <w:t>Group</w:t>
+            </w:r>
+          </w:p>
+        </w:tc>
+        <w:tc>
+          <w:tcPr>
+            <w:tcW w:type="dxa" w:w="3135"/>
+          </w:tcPr>
+          <w:p>
+            <w:r>
+              <w:rPr>
+                <w:b/>
+              </w:rPr>
+              <w:t>Cases</w:t>
+            </w:r>
+          </w:p>
+        </w:tc>
+        <w:tc>
+          <w:tcPr>
+            <w:tcW w:type="dxa" w:w="3135"/>
+          </w:tcPr>
+          <w:p>
+            <w:r>
+              <w:rPr>
+                <w:b/>
+              </w:rPr>
+              <w:t>%</w:t>
+            </w:r>
+          </w:p>
+        </w:tc>
+      </w:tr>
+      <w:tr>
+        <w:tc>
+          <w:tcPr>
+            <w:tcW w:type="dxa" w:w="3135"/>
+          </w:tcPr>
+          <w:p>
+            <w:r>
+              <w:t>eFST I–II</w:t>
+            </w:r>
+          </w:p>
+        </w:tc>
+        <w:tc>
+          <w:tcPr>
+            <w:tcW w:type="dxa" w:w="3135"/>
+          </w:tcPr>
+          <w:p>
+            <w:r>
+              <w:t>1,773</w:t>
+            </w:r>
+          </w:p>
+        </w:tc>
+        <w:tc>
+          <w:tcPr>
+            <w:tcW w:type="dxa" w:w="3135"/>
+          </w:tcPr>
+          <w:p>
+            <w:r>
+              <w:t>35.2</w:t>
+            </w:r>
+          </w:p>
+        </w:tc>
+      </w:tr>
+      <w:tr>
+        <w:tc>
+          <w:tcPr>
+            <w:tcW w:type="dxa" w:w="3135"/>
+          </w:tcPr>
+          <w:p>
+            <w:r>
+              <w:t>eFST III–IV</w:t>
+            </w:r>
+          </w:p>
+        </w:tc>
+        <w:tc>
+          <w:tcPr>
+            <w:tcW w:type="dxa" w:w="3135"/>
+          </w:tcPr>
+          <w:p>
+            <w:r>
+              <w:t>2,161</w:t>
+            </w:r>
+          </w:p>
+        </w:tc>
+        <w:tc>
+          <w:tcPr>
+            <w:tcW w:type="dxa" w:w="3135"/>
+          </w:tcPr>
+          <w:p>
+            <w:r>
+              <w:t>42.9</w:t>
+            </w:r>
+          </w:p>
+        </w:tc>
+      </w:tr>
+      <w:tr>
+        <w:tc>
+          <w:tcPr>
+            <w:tcW w:type="dxa" w:w="3135"/>
+          </w:tcPr>
+          <w:p>
+            <w:r>
+              <w:t>eFST V–VI</w:t>
+            </w:r>
+          </w:p>
+        </w:tc>
+        <w:tc>
+          <w:tcPr>
+            <w:tcW w:type="dxa" w:w="3135"/>
+          </w:tcPr>
+          <w:p>
+            <w:r>
+              <w:t>436</w:t>
+            </w:r>
+          </w:p>
+        </w:tc>
+        <w:tc>
+          <w:tcPr>
+            <w:tcW w:type="dxa" w:w="3135"/>
+          </w:tcPr>
+          <w:p>
+            <w:r>
+              <w:t>8.7</w:t>
+            </w:r>
+          </w:p>
+        </w:tc>
+      </w:tr>
+      <w:tr>
+        <w:tc>
+          <w:tcPr>
+            <w:tcW w:type="dxa" w:w="3135"/>
+          </w:tcPr>
+          <w:p>
+            <w:r>
+              <w:t>eFST missing</w:t>
+            </w:r>
+          </w:p>
+        </w:tc>
+        <w:tc>
+          <w:tcPr>
+            <w:tcW w:type="dxa" w:w="3135"/>
+          </w:tcPr>
+          <w:p>
+            <w:r>
+              <w:t>663</w:t>
+            </w:r>
+          </w:p>
+        </w:tc>
+        <w:tc>
+          <w:tcPr>
+            <w:tcW w:type="dxa" w:w="3135"/>
+          </w:tcPr>
+          <w:p>
+            <w:r>
+              <w:t>13.2</w:t>
+            </w:r>
+          </w:p>
+        </w:tc>
+      </w:tr>
+      <w:tr>
+        <w:tc>
+          <w:tcPr>
+            <w:tcW w:type="dxa" w:w="3135"/>
+          </w:tcPr>
+          <w:p>
+            <w:r>
+              <w:t>eMST 1–3 (US annotators)</w:t>
+            </w:r>
+          </w:p>
+        </w:tc>
+        <w:tc>
+          <w:tcPr>
+            <w:tcW w:type="dxa" w:w="3135"/>
+          </w:tcPr>
+          <w:p>
+            <w:r>
+              <w:t>3,502</w:t>
+            </w:r>
+          </w:p>
+        </w:tc>
+        <w:tc>
+          <w:tcPr>
+            <w:tcW w:type="dxa" w:w="3135"/>
+          </w:tcPr>
+          <w:p>
+            <w:r>
+              <w:t>69.6</w:t>
+            </w:r>
+          </w:p>
+        </w:tc>
+      </w:tr>
+      <w:tr>
+        <w:tc>
+          <w:tcPr>
+            <w:tcW w:type="dxa" w:w="3135"/>
+          </w:tcPr>
+          <w:p>
+            <w:r>
+              <w:t>eMST 4–6 (US annotators)</w:t>
+            </w:r>
+          </w:p>
+        </w:tc>
+        <w:tc>
+          <w:tcPr>
+            <w:tcW w:type="dxa" w:w="3135"/>
+          </w:tcPr>
+          <w:p>
+            <w:r>
+              <w:t>1,296</w:t>
+            </w:r>
+          </w:p>
+        </w:tc>
+        <w:tc>
+          <w:tcPr>
+            <w:tcW w:type="dxa" w:w="3135"/>
+          </w:tcPr>
+          <w:p>
+            <w:r>
+              <w:t>25.8</w:t>
+            </w:r>
+          </w:p>
+        </w:tc>
+      </w:tr>
+      <w:tr>
+        <w:tc>
+          <w:tcPr>
+            <w:tcW w:type="dxa" w:w="3135"/>
+          </w:tcPr>
+          <w:p>
+            <w:r>
+              <w:t>eMST 7–10 (US annotators)</w:t>
+            </w:r>
+          </w:p>
+        </w:tc>
+        <w:tc>
+          <w:tcPr>
+            <w:tcW w:type="dxa" w:w="3135"/>
+          </w:tcPr>
+          <w:p>
+            <w:r>
+              <w:t>207</w:t>
+            </w:r>
+          </w:p>
+        </w:tc>
+        <w:tc>
+          <w:tcPr>
+            <w:tcW w:type="dxa" w:w="3135"/>
+          </w:tcPr>
+          <w:p>
+            <w:r>
+              <w:t>4.1</w:t>
+            </w:r>
+          </w:p>
+        </w:tc>
+      </w:tr>
+    </w:tbl>
+    <w:p>
+      <w:pPr>
+        <w:ind w:firstLine="709"/>
+        <w:jc w:val="both"/>
+      </w:pPr>
+      <w:r>
+        <w:t>We define eFST as the median of up to three dermatologist Fitzpatrick labels per case, rounded half up; 73.7% of cases have a single label and 13.2% have none. Darker tones are under-represented (Table 1): eFST V–VI covers 8.7% of cases and type VI only 68 cases (1.35%). On the Monk scale, eMST 7–10 covers 4.1% of cases according to US annotators but only 1.0% according to India annotators, so the annotator pool must be fixed and reported. Estimates for darker groups will carry wide confidence intervals.</w:t>
+      </w:r>
+    </w:p>
+    <w:p>
+      <w:pPr>
+        <w:ind w:firstLine="709"/>
+        <w:jc w:val="both"/>
+      </w:pPr>
+      <w:r>
+        <w:t>Weighted dermatologist condition labels are available for 3,061 cases (60.8%); the first dermatologist rated image quality insufficient for 38.3% of cases. These labels are retrospective differential assessments, not clinically confirmed outcomes, and our metrics therefore measure agreement with dermatologist labels. The most frequent top-weighted labels are eczema (488), allergic contact dermatitis (270), urticaria (214), insect bite (185) and folliculitis (142), while acne (61) and rosacea (29) are rare; these counts will constrain the final class set. All splits are made at the case level so that images of one case never cross splits.</w:t>
+      </w:r>
+    </w:p>
+    <w:p>
+      <w:pPr>
+        <w:pStyle w:val="Heading1"/>
+      </w:pPr>
+      <w:r>
+        <w:t>References</w:t>
+      </w:r>
+    </w:p>
+    <w:p>
+      <w:pPr>
+        <w:ind w:firstLine="0"/>
+      </w:pPr>
+      <w:r>
+        <w:t>[1] Google Research, SCIN: Skin Condition Image Network, GitHub repository. https://github.com/google-research-datasets/scin</w:t>
+      </w:r>
+    </w:p>
+    <w:p>
+      <w:pPr>
+        <w:ind w:firstLine="0"/>
+      </w:pPr>
+      <w:r>
+        <w:t>[2] Google Research, SCIN Data Use License. https://github.com/google-research-datasets/scin/blob/main/LICENSE</w:t>
+      </w:r>
+    </w:p>
+    <w:p>
+      <w:pPr>
+        <w:ind w:firstLine="0"/>
+      </w:pPr>
+      <w:r>
+        <w:t>[3] Google Research, SCIN dataset schema documentation. https://github.com/google-research-datasets/scin/blob/main/dataset_schema.md</w:t>
       </w:r>
     </w:p>
     <w:sectPr>

</xml_diff>

<commit_message>
docs: add label derivation section to thesis and paper, journal entry
</commit_message>
<xml_diff>
--- a/docs/Paper_Introduction.docx
+++ b/docs/Paper_Introduction.docx
@@ -462,6 +462,445 @@
     </w:p>
     <w:p>
       <w:pPr>
+        <w:pStyle w:val="Heading2"/>
+      </w:pPr>
+      <w:r>
+        <w:t>3.2 Target skin-concern categories</w:t>
+      </w:r>
+    </w:p>
+    <w:p>
+      <w:pPr>
+        <w:ind w:firstLine="709"/>
+        <w:jc w:val="both"/>
+      </w:pPr>
+      <w:r>
+        <w:t>SCIN condition strings number over 370 distinct dermatologist differentials, most of them rare, so we group them into five target categories: acne, eczema_dermatitis, redness_rosacea, normal_other and excluded (ml/labels/label_map.yaml, built by ml/labels/build_labels.py). For each case_id, the weights of strings mapped to the same category are summed; the category with the largest sum becomes the primary label if the sum reaches a configurable threshold (0.40). Ties, sub-threshold cases and unmapped strings are labelled excluded. These are coarse skin-concern groupings, not clinical classes.</w:t>
+      </w:r>
+    </w:p>
+    <w:p>
+      <w:pPr>
+        <w:ind w:firstLine="709"/>
+        <w:jc w:val="both"/>
+      </w:pPr>
+      <w:r>
+        <w:t>Of 5,033 cases, 144 are acne, 1,068 eczema_dermatitis, 44 redness_rosacea, 553 normal_other and 3,224 excluded (1,972 of which have no weighted label). Only 10 acne and 1 redness_rosacea cases fall in eFST V–VI (Table 2), so per-tone estimates for these categories will have very wide confidence intervals. The string-to-category mapping is an author decision (e.g. folliculitis is grouped with acne) and is a limitation.</w:t>
+      </w:r>
+    </w:p>
+    <w:p>
+      <w:r>
+        <w:rPr>
+          <w:i/>
+        </w:rPr>
+        <w:t>Table 2. Target categories by eFST group (SCIN, threshold 0.40).</w:t>
+      </w:r>
+    </w:p>
+    <w:tbl>
+      <w:tblPr>
+        <w:tblStyle w:val="TableGrid"/>
+        <w:tblW w:type="auto" w:w="0"/>
+        <w:tblLook w:firstColumn="1" w:firstRow="1" w:lastColumn="0" w:lastRow="0" w:noHBand="0" w:noVBand="1" w:val="04A0"/>
+      </w:tblPr>
+      <w:tblGrid>
+        <w:gridCol w:w="1568"/>
+        <w:gridCol w:w="1568"/>
+        <w:gridCol w:w="1568"/>
+        <w:gridCol w:w="1568"/>
+        <w:gridCol w:w="1568"/>
+        <w:gridCol w:w="1568"/>
+      </w:tblGrid>
+      <w:tr>
+        <w:tc>
+          <w:tcPr>
+            <w:tcW w:type="dxa" w:w="1568"/>
+          </w:tcPr>
+          <w:p>
+            <w:r>
+              <w:rPr>
+                <w:b/>
+              </w:rPr>
+              <w:t>Category</w:t>
+            </w:r>
+          </w:p>
+        </w:tc>
+        <w:tc>
+          <w:tcPr>
+            <w:tcW w:type="dxa" w:w="1568"/>
+          </w:tcPr>
+          <w:p>
+            <w:r>
+              <w:rPr>
+                <w:b/>
+              </w:rPr>
+              <w:t>eFST I–II</w:t>
+            </w:r>
+          </w:p>
+        </w:tc>
+        <w:tc>
+          <w:tcPr>
+            <w:tcW w:type="dxa" w:w="1568"/>
+          </w:tcPr>
+          <w:p>
+            <w:r>
+              <w:rPr>
+                <w:b/>
+              </w:rPr>
+              <w:t>eFST III–IV</w:t>
+            </w:r>
+          </w:p>
+        </w:tc>
+        <w:tc>
+          <w:tcPr>
+            <w:tcW w:type="dxa" w:w="1568"/>
+          </w:tcPr>
+          <w:p>
+            <w:r>
+              <w:rPr>
+                <w:b/>
+              </w:rPr>
+              <w:t>eFST V–VI</w:t>
+            </w:r>
+          </w:p>
+        </w:tc>
+        <w:tc>
+          <w:tcPr>
+            <w:tcW w:type="dxa" w:w="1568"/>
+          </w:tcPr>
+          <w:p>
+            <w:r>
+              <w:rPr>
+                <w:b/>
+              </w:rPr>
+              <w:t>eFST missing</w:t>
+            </w:r>
+          </w:p>
+        </w:tc>
+        <w:tc>
+          <w:tcPr>
+            <w:tcW w:type="dxa" w:w="1568"/>
+          </w:tcPr>
+          <w:p>
+            <w:r>
+              <w:rPr>
+                <w:b/>
+              </w:rPr>
+              <w:t>Total</w:t>
+            </w:r>
+          </w:p>
+        </w:tc>
+      </w:tr>
+      <w:tr>
+        <w:tc>
+          <w:tcPr>
+            <w:tcW w:type="dxa" w:w="1568"/>
+          </w:tcPr>
+          <w:p>
+            <w:r>
+              <w:t>acne</w:t>
+            </w:r>
+          </w:p>
+        </w:tc>
+        <w:tc>
+          <w:tcPr>
+            <w:tcW w:type="dxa" w:w="1568"/>
+          </w:tcPr>
+          <w:p>
+            <w:r>
+              <w:t>55</w:t>
+            </w:r>
+          </w:p>
+        </w:tc>
+        <w:tc>
+          <w:tcPr>
+            <w:tcW w:type="dxa" w:w="1568"/>
+          </w:tcPr>
+          <w:p>
+            <w:r>
+              <w:t>77</w:t>
+            </w:r>
+          </w:p>
+        </w:tc>
+        <w:tc>
+          <w:tcPr>
+            <w:tcW w:type="dxa" w:w="1568"/>
+          </w:tcPr>
+          <w:p>
+            <w:r>
+              <w:t>10</w:t>
+            </w:r>
+          </w:p>
+        </w:tc>
+        <w:tc>
+          <w:tcPr>
+            <w:tcW w:type="dxa" w:w="1568"/>
+          </w:tcPr>
+          <w:p>
+            <w:r>
+              <w:t>2</w:t>
+            </w:r>
+          </w:p>
+        </w:tc>
+        <w:tc>
+          <w:tcPr>
+            <w:tcW w:type="dxa" w:w="1568"/>
+          </w:tcPr>
+          <w:p>
+            <w:r>
+              <w:t>144</w:t>
+            </w:r>
+          </w:p>
+        </w:tc>
+      </w:tr>
+      <w:tr>
+        <w:tc>
+          <w:tcPr>
+            <w:tcW w:type="dxa" w:w="1568"/>
+          </w:tcPr>
+          <w:p>
+            <w:r>
+              <w:t>eczema_dermatitis</w:t>
+            </w:r>
+          </w:p>
+        </w:tc>
+        <w:tc>
+          <w:tcPr>
+            <w:tcW w:type="dxa" w:w="1568"/>
+          </w:tcPr>
+          <w:p>
+            <w:r>
+              <w:t>478</w:t>
+            </w:r>
+          </w:p>
+        </w:tc>
+        <w:tc>
+          <w:tcPr>
+            <w:tcW w:type="dxa" w:w="1568"/>
+          </w:tcPr>
+          <w:p>
+            <w:r>
+              <w:t>460</w:t>
+            </w:r>
+          </w:p>
+        </w:tc>
+        <w:tc>
+          <w:tcPr>
+            <w:tcW w:type="dxa" w:w="1568"/>
+          </w:tcPr>
+          <w:p>
+            <w:r>
+              <w:t>89</w:t>
+            </w:r>
+          </w:p>
+        </w:tc>
+        <w:tc>
+          <w:tcPr>
+            <w:tcW w:type="dxa" w:w="1568"/>
+          </w:tcPr>
+          <w:p>
+            <w:r>
+              <w:t>41</w:t>
+            </w:r>
+          </w:p>
+        </w:tc>
+        <w:tc>
+          <w:tcPr>
+            <w:tcW w:type="dxa" w:w="1568"/>
+          </w:tcPr>
+          <w:p>
+            <w:r>
+              <w:t>1,068</w:t>
+            </w:r>
+          </w:p>
+        </w:tc>
+      </w:tr>
+      <w:tr>
+        <w:tc>
+          <w:tcPr>
+            <w:tcW w:type="dxa" w:w="1568"/>
+          </w:tcPr>
+          <w:p>
+            <w:r>
+              <w:t>redness_rosacea</w:t>
+            </w:r>
+          </w:p>
+        </w:tc>
+        <w:tc>
+          <w:tcPr>
+            <w:tcW w:type="dxa" w:w="1568"/>
+          </w:tcPr>
+          <w:p>
+            <w:r>
+              <w:t>30</w:t>
+            </w:r>
+          </w:p>
+        </w:tc>
+        <w:tc>
+          <w:tcPr>
+            <w:tcW w:type="dxa" w:w="1568"/>
+          </w:tcPr>
+          <w:p>
+            <w:r>
+              <w:t>11</w:t>
+            </w:r>
+          </w:p>
+        </w:tc>
+        <w:tc>
+          <w:tcPr>
+            <w:tcW w:type="dxa" w:w="1568"/>
+          </w:tcPr>
+          <w:p>
+            <w:r>
+              <w:t>1</w:t>
+            </w:r>
+          </w:p>
+        </w:tc>
+        <w:tc>
+          <w:tcPr>
+            <w:tcW w:type="dxa" w:w="1568"/>
+          </w:tcPr>
+          <w:p>
+            <w:r>
+              <w:t>2</w:t>
+            </w:r>
+          </w:p>
+        </w:tc>
+        <w:tc>
+          <w:tcPr>
+            <w:tcW w:type="dxa" w:w="1568"/>
+          </w:tcPr>
+          <w:p>
+            <w:r>
+              <w:t>44</w:t>
+            </w:r>
+          </w:p>
+        </w:tc>
+      </w:tr>
+      <w:tr>
+        <w:tc>
+          <w:tcPr>
+            <w:tcW w:type="dxa" w:w="1568"/>
+          </w:tcPr>
+          <w:p>
+            <w:r>
+              <w:t>normal_other</w:t>
+            </w:r>
+          </w:p>
+        </w:tc>
+        <w:tc>
+          <w:tcPr>
+            <w:tcW w:type="dxa" w:w="1568"/>
+          </w:tcPr>
+          <w:p>
+            <w:r>
+              <w:t>216</w:t>
+            </w:r>
+          </w:p>
+        </w:tc>
+        <w:tc>
+          <w:tcPr>
+            <w:tcW w:type="dxa" w:w="1568"/>
+          </w:tcPr>
+          <w:p>
+            <w:r>
+              <w:t>258</w:t>
+            </w:r>
+          </w:p>
+        </w:tc>
+        <w:tc>
+          <w:tcPr>
+            <w:tcW w:type="dxa" w:w="1568"/>
+          </w:tcPr>
+          <w:p>
+            <w:r>
+              <w:t>49</w:t>
+            </w:r>
+          </w:p>
+        </w:tc>
+        <w:tc>
+          <w:tcPr>
+            <w:tcW w:type="dxa" w:w="1568"/>
+          </w:tcPr>
+          <w:p>
+            <w:r>
+              <w:t>30</w:t>
+            </w:r>
+          </w:p>
+        </w:tc>
+        <w:tc>
+          <w:tcPr>
+            <w:tcW w:type="dxa" w:w="1568"/>
+          </w:tcPr>
+          <w:p>
+            <w:r>
+              <w:t>553</w:t>
+            </w:r>
+          </w:p>
+        </w:tc>
+      </w:tr>
+      <w:tr>
+        <w:tc>
+          <w:tcPr>
+            <w:tcW w:type="dxa" w:w="1568"/>
+          </w:tcPr>
+          <w:p>
+            <w:r>
+              <w:t>excluded</w:t>
+            </w:r>
+          </w:p>
+        </w:tc>
+        <w:tc>
+          <w:tcPr>
+            <w:tcW w:type="dxa" w:w="1568"/>
+          </w:tcPr>
+          <w:p>
+            <w:r>
+              <w:t>994</w:t>
+            </w:r>
+          </w:p>
+        </w:tc>
+        <w:tc>
+          <w:tcPr>
+            <w:tcW w:type="dxa" w:w="1568"/>
+          </w:tcPr>
+          <w:p>
+            <w:r>
+              <w:t>1,355</w:t>
+            </w:r>
+          </w:p>
+        </w:tc>
+        <w:tc>
+          <w:tcPr>
+            <w:tcW w:type="dxa" w:w="1568"/>
+          </w:tcPr>
+          <w:p>
+            <w:r>
+              <w:t>287</w:t>
+            </w:r>
+          </w:p>
+        </w:tc>
+        <w:tc>
+          <w:tcPr>
+            <w:tcW w:type="dxa" w:w="1568"/>
+          </w:tcPr>
+          <w:p>
+            <w:r>
+              <w:t>588</w:t>
+            </w:r>
+          </w:p>
+        </w:tc>
+        <w:tc>
+          <w:tcPr>
+            <w:tcW w:type="dxa" w:w="1568"/>
+          </w:tcPr>
+          <w:p>
+            <w:r>
+              <w:t>3,224</w:t>
+            </w:r>
+          </w:p>
+        </w:tc>
+      </w:tr>
+    </w:tbl>
+    <w:p>
+      <w:pPr>
         <w:pStyle w:val="Heading1"/>
       </w:pPr>
       <w:r>

</xml_diff>

<commit_message>
docs: explain FST, eFST and eMST scales in thesis and paper
</commit_message>
<xml_diff>
--- a/docs/Paper_Introduction.docx
+++ b/docs/Paper_Introduction.docx
@@ -901,6 +901,41 @@
     </w:tbl>
     <w:p>
       <w:pPr>
+        <w:pStyle w:val="Heading2"/>
+      </w:pPr>
+      <w:r>
+        <w:t>3.3 Skin-tone scales and groups</w:t>
+      </w:r>
+    </w:p>
+    <w:p>
+      <w:pPr>
+        <w:ind w:firstLine="709"/>
+        <w:jc w:val="both"/>
+      </w:pPr>
+      <w:r>
+        <w:t>The Fitzpatrick scale (FST) classifies skin into six types by its reaction to sun: type I (very pale skin) always burns and never tans, type III sometimes burns and tans gradually, and type VI (very dark skin) almost never burns (https://doi.org/10.1001/archderm.1988.01670060015008) [4]. In SCIN, up to three dermatologists assigned each case an FST label from the photographs [3]. We define eFST (estimated Fitzpatrick skin type) as the median of the available labels, rounded half up. eFST is a rater's estimate from a photograph, not a measurement of the skin, and is affected by lighting.</w:t>
+      </w:r>
+    </w:p>
+    <w:p>
+      <w:pPr>
+        <w:ind w:firstLine="709"/>
+        <w:jc w:val="both"/>
+      </w:pPr>
+      <w:r>
+        <w:t>Because single types are sparse (type VI has only 68 cases), we pair them: I–II (lightest skin, 1,773 cases), III–IV (medium skin, 2,161 cases) and V–VI (darkest skin, 436 cases). The 663 cases with no FST label form a separate missing group.</w:t>
+      </w:r>
+    </w:p>
+    <w:p>
+      <w:pPr>
+        <w:ind w:firstLine="709"/>
+        <w:jc w:val="both"/>
+      </w:pPr>
+      <w:r>
+        <w:t>The second scale, eMST (estimated Monk Skin Tone), uses the 10-point Monk scale (https://skintone.google/) [5] as rated by annotators; we group it as 1–3 (light), 4–6 (medium) and 7–10 (dark). eMST is not equivalent to eFST: the two are different measures of skin tone and are reported separately.</w:t>
+      </w:r>
+    </w:p>
+    <w:p>
+      <w:pPr>
         <w:pStyle w:val="Heading1"/>
       </w:pPr>
       <w:r>
@@ -929,6 +964,22 @@
       </w:pPr>
       <w:r>
         <w:t>[3] Google Research, SCIN dataset schema documentation. https://github.com/google-research-datasets/scin/blob/main/dataset_schema.md</w:t>
+      </w:r>
+    </w:p>
+    <w:p>
+      <w:pPr>
+        <w:ind w:firstLine="0"/>
+      </w:pPr>
+      <w:r>
+        <w:t>[4] T. B. Fitzpatrick, The validity and practicality of sun-reactive skin types I through VI, Archives of Dermatology 124(6), 1988, 869–871. https://doi.org/10.1001/archderm.1988.01670060015008</w:t>
+      </w:r>
+    </w:p>
+    <w:p>
+      <w:pPr>
+        <w:ind w:firstLine="0"/>
+      </w:pPr>
+      <w:r>
+        <w:t>[5] Google Research, Monk Skin Tone Scale. https://skintone.google/</w:t>
       </w:r>
     </w:p>
     <w:sectPr>

</xml_diff>

<commit_message>
feat(ml): derive case labels and encode the questionnaire (Tasks 1.2-1.3)
Label map and build_labels.py with class counts by skin tone; questionnaire schema, encoder
and feature table with missingness masks; skin-tone scales explained in thesis and paper.
</commit_message>
<xml_diff>
--- a/docs/Paper_Introduction.docx
+++ b/docs/Paper_Introduction.docx
@@ -462,6 +462,515 @@
     </w:p>
     <w:p>
       <w:pPr>
+        <w:pStyle w:val="Heading2"/>
+      </w:pPr>
+      <w:r>
+        <w:t>3.2 Target skin-concern categories</w:t>
+      </w:r>
+    </w:p>
+    <w:p>
+      <w:pPr>
+        <w:ind w:firstLine="709"/>
+        <w:jc w:val="both"/>
+      </w:pPr>
+      <w:r>
+        <w:t>SCIN condition strings number over 370 distinct dermatologist differentials, most of them rare, so we group them into five target categories: acne, eczema_dermatitis, redness_rosacea, normal_other and excluded (ml/labels/label_map.yaml, built by ml/labels/build_labels.py). For each case_id, the weights of strings mapped to the same category are summed; the category with the largest sum becomes the primary label if the sum reaches a configurable threshold (0.40). Ties, sub-threshold cases and unmapped strings are labelled excluded. These are coarse skin-concern groupings, not clinical classes.</w:t>
+      </w:r>
+    </w:p>
+    <w:p>
+      <w:pPr>
+        <w:ind w:firstLine="709"/>
+        <w:jc w:val="both"/>
+      </w:pPr>
+      <w:r>
+        <w:t>Of 5,033 cases, 144 are acne, 1,068 eczema_dermatitis, 44 redness_rosacea, 553 normal_other and 3,224 excluded (1,972 of which have no weighted label). Only 10 acne and 1 redness_rosacea cases fall in eFST V–VI (Table 2), so per-tone estimates for these categories will have very wide confidence intervals. The string-to-category mapping is an author decision (e.g. folliculitis is grouped with acne) and is a limitation.</w:t>
+      </w:r>
+    </w:p>
+    <w:p>
+      <w:r>
+        <w:rPr>
+          <w:i/>
+        </w:rPr>
+        <w:t>Table 2. Target categories by eFST group (SCIN, threshold 0.40).</w:t>
+      </w:r>
+    </w:p>
+    <w:tbl>
+      <w:tblPr>
+        <w:tblStyle w:val="TableGrid"/>
+        <w:tblW w:type="auto" w:w="0"/>
+        <w:tblLook w:firstColumn="1" w:firstRow="1" w:lastColumn="0" w:lastRow="0" w:noHBand="0" w:noVBand="1" w:val="04A0"/>
+      </w:tblPr>
+      <w:tblGrid>
+        <w:gridCol w:w="1568"/>
+        <w:gridCol w:w="1568"/>
+        <w:gridCol w:w="1568"/>
+        <w:gridCol w:w="1568"/>
+        <w:gridCol w:w="1568"/>
+        <w:gridCol w:w="1568"/>
+      </w:tblGrid>
+      <w:tr>
+        <w:tc>
+          <w:tcPr>
+            <w:tcW w:type="dxa" w:w="1568"/>
+          </w:tcPr>
+          <w:p>
+            <w:r>
+              <w:rPr>
+                <w:b/>
+              </w:rPr>
+              <w:t>Category</w:t>
+            </w:r>
+          </w:p>
+        </w:tc>
+        <w:tc>
+          <w:tcPr>
+            <w:tcW w:type="dxa" w:w="1568"/>
+          </w:tcPr>
+          <w:p>
+            <w:r>
+              <w:rPr>
+                <w:b/>
+              </w:rPr>
+              <w:t>eFST I–II</w:t>
+            </w:r>
+          </w:p>
+        </w:tc>
+        <w:tc>
+          <w:tcPr>
+            <w:tcW w:type="dxa" w:w="1568"/>
+          </w:tcPr>
+          <w:p>
+            <w:r>
+              <w:rPr>
+                <w:b/>
+              </w:rPr>
+              <w:t>eFST III–IV</w:t>
+            </w:r>
+          </w:p>
+        </w:tc>
+        <w:tc>
+          <w:tcPr>
+            <w:tcW w:type="dxa" w:w="1568"/>
+          </w:tcPr>
+          <w:p>
+            <w:r>
+              <w:rPr>
+                <w:b/>
+              </w:rPr>
+              <w:t>eFST V–VI</w:t>
+            </w:r>
+          </w:p>
+        </w:tc>
+        <w:tc>
+          <w:tcPr>
+            <w:tcW w:type="dxa" w:w="1568"/>
+          </w:tcPr>
+          <w:p>
+            <w:r>
+              <w:rPr>
+                <w:b/>
+              </w:rPr>
+              <w:t>eFST missing</w:t>
+            </w:r>
+          </w:p>
+        </w:tc>
+        <w:tc>
+          <w:tcPr>
+            <w:tcW w:type="dxa" w:w="1568"/>
+          </w:tcPr>
+          <w:p>
+            <w:r>
+              <w:rPr>
+                <w:b/>
+              </w:rPr>
+              <w:t>Total</w:t>
+            </w:r>
+          </w:p>
+        </w:tc>
+      </w:tr>
+      <w:tr>
+        <w:tc>
+          <w:tcPr>
+            <w:tcW w:type="dxa" w:w="1568"/>
+          </w:tcPr>
+          <w:p>
+            <w:r>
+              <w:t>acne</w:t>
+            </w:r>
+          </w:p>
+        </w:tc>
+        <w:tc>
+          <w:tcPr>
+            <w:tcW w:type="dxa" w:w="1568"/>
+          </w:tcPr>
+          <w:p>
+            <w:r>
+              <w:t>55</w:t>
+            </w:r>
+          </w:p>
+        </w:tc>
+        <w:tc>
+          <w:tcPr>
+            <w:tcW w:type="dxa" w:w="1568"/>
+          </w:tcPr>
+          <w:p>
+            <w:r>
+              <w:t>77</w:t>
+            </w:r>
+          </w:p>
+        </w:tc>
+        <w:tc>
+          <w:tcPr>
+            <w:tcW w:type="dxa" w:w="1568"/>
+          </w:tcPr>
+          <w:p>
+            <w:r>
+              <w:t>10</w:t>
+            </w:r>
+          </w:p>
+        </w:tc>
+        <w:tc>
+          <w:tcPr>
+            <w:tcW w:type="dxa" w:w="1568"/>
+          </w:tcPr>
+          <w:p>
+            <w:r>
+              <w:t>2</w:t>
+            </w:r>
+          </w:p>
+        </w:tc>
+        <w:tc>
+          <w:tcPr>
+            <w:tcW w:type="dxa" w:w="1568"/>
+          </w:tcPr>
+          <w:p>
+            <w:r>
+              <w:t>144</w:t>
+            </w:r>
+          </w:p>
+        </w:tc>
+      </w:tr>
+      <w:tr>
+        <w:tc>
+          <w:tcPr>
+            <w:tcW w:type="dxa" w:w="1568"/>
+          </w:tcPr>
+          <w:p>
+            <w:r>
+              <w:t>eczema_dermatitis</w:t>
+            </w:r>
+          </w:p>
+        </w:tc>
+        <w:tc>
+          <w:tcPr>
+            <w:tcW w:type="dxa" w:w="1568"/>
+          </w:tcPr>
+          <w:p>
+            <w:r>
+              <w:t>478</w:t>
+            </w:r>
+          </w:p>
+        </w:tc>
+        <w:tc>
+          <w:tcPr>
+            <w:tcW w:type="dxa" w:w="1568"/>
+          </w:tcPr>
+          <w:p>
+            <w:r>
+              <w:t>460</w:t>
+            </w:r>
+          </w:p>
+        </w:tc>
+        <w:tc>
+          <w:tcPr>
+            <w:tcW w:type="dxa" w:w="1568"/>
+          </w:tcPr>
+          <w:p>
+            <w:r>
+              <w:t>89</w:t>
+            </w:r>
+          </w:p>
+        </w:tc>
+        <w:tc>
+          <w:tcPr>
+            <w:tcW w:type="dxa" w:w="1568"/>
+          </w:tcPr>
+          <w:p>
+            <w:r>
+              <w:t>41</w:t>
+            </w:r>
+          </w:p>
+        </w:tc>
+        <w:tc>
+          <w:tcPr>
+            <w:tcW w:type="dxa" w:w="1568"/>
+          </w:tcPr>
+          <w:p>
+            <w:r>
+              <w:t>1,068</w:t>
+            </w:r>
+          </w:p>
+        </w:tc>
+      </w:tr>
+      <w:tr>
+        <w:tc>
+          <w:tcPr>
+            <w:tcW w:type="dxa" w:w="1568"/>
+          </w:tcPr>
+          <w:p>
+            <w:r>
+              <w:t>redness_rosacea</w:t>
+            </w:r>
+          </w:p>
+        </w:tc>
+        <w:tc>
+          <w:tcPr>
+            <w:tcW w:type="dxa" w:w="1568"/>
+          </w:tcPr>
+          <w:p>
+            <w:r>
+              <w:t>30</w:t>
+            </w:r>
+          </w:p>
+        </w:tc>
+        <w:tc>
+          <w:tcPr>
+            <w:tcW w:type="dxa" w:w="1568"/>
+          </w:tcPr>
+          <w:p>
+            <w:r>
+              <w:t>11</w:t>
+            </w:r>
+          </w:p>
+        </w:tc>
+        <w:tc>
+          <w:tcPr>
+            <w:tcW w:type="dxa" w:w="1568"/>
+          </w:tcPr>
+          <w:p>
+            <w:r>
+              <w:t>1</w:t>
+            </w:r>
+          </w:p>
+        </w:tc>
+        <w:tc>
+          <w:tcPr>
+            <w:tcW w:type="dxa" w:w="1568"/>
+          </w:tcPr>
+          <w:p>
+            <w:r>
+              <w:t>2</w:t>
+            </w:r>
+          </w:p>
+        </w:tc>
+        <w:tc>
+          <w:tcPr>
+            <w:tcW w:type="dxa" w:w="1568"/>
+          </w:tcPr>
+          <w:p>
+            <w:r>
+              <w:t>44</w:t>
+            </w:r>
+          </w:p>
+        </w:tc>
+      </w:tr>
+      <w:tr>
+        <w:tc>
+          <w:tcPr>
+            <w:tcW w:type="dxa" w:w="1568"/>
+          </w:tcPr>
+          <w:p>
+            <w:r>
+              <w:t>normal_other</w:t>
+            </w:r>
+          </w:p>
+        </w:tc>
+        <w:tc>
+          <w:tcPr>
+            <w:tcW w:type="dxa" w:w="1568"/>
+          </w:tcPr>
+          <w:p>
+            <w:r>
+              <w:t>216</w:t>
+            </w:r>
+          </w:p>
+        </w:tc>
+        <w:tc>
+          <w:tcPr>
+            <w:tcW w:type="dxa" w:w="1568"/>
+          </w:tcPr>
+          <w:p>
+            <w:r>
+              <w:t>258</w:t>
+            </w:r>
+          </w:p>
+        </w:tc>
+        <w:tc>
+          <w:tcPr>
+            <w:tcW w:type="dxa" w:w="1568"/>
+          </w:tcPr>
+          <w:p>
+            <w:r>
+              <w:t>49</w:t>
+            </w:r>
+          </w:p>
+        </w:tc>
+        <w:tc>
+          <w:tcPr>
+            <w:tcW w:type="dxa" w:w="1568"/>
+          </w:tcPr>
+          <w:p>
+            <w:r>
+              <w:t>30</w:t>
+            </w:r>
+          </w:p>
+        </w:tc>
+        <w:tc>
+          <w:tcPr>
+            <w:tcW w:type="dxa" w:w="1568"/>
+          </w:tcPr>
+          <w:p>
+            <w:r>
+              <w:t>553</w:t>
+            </w:r>
+          </w:p>
+        </w:tc>
+      </w:tr>
+      <w:tr>
+        <w:tc>
+          <w:tcPr>
+            <w:tcW w:type="dxa" w:w="1568"/>
+          </w:tcPr>
+          <w:p>
+            <w:r>
+              <w:t>excluded</w:t>
+            </w:r>
+          </w:p>
+        </w:tc>
+        <w:tc>
+          <w:tcPr>
+            <w:tcW w:type="dxa" w:w="1568"/>
+          </w:tcPr>
+          <w:p>
+            <w:r>
+              <w:t>994</w:t>
+            </w:r>
+          </w:p>
+        </w:tc>
+        <w:tc>
+          <w:tcPr>
+            <w:tcW w:type="dxa" w:w="1568"/>
+          </w:tcPr>
+          <w:p>
+            <w:r>
+              <w:t>1,355</w:t>
+            </w:r>
+          </w:p>
+        </w:tc>
+        <w:tc>
+          <w:tcPr>
+            <w:tcW w:type="dxa" w:w="1568"/>
+          </w:tcPr>
+          <w:p>
+            <w:r>
+              <w:t>287</w:t>
+            </w:r>
+          </w:p>
+        </w:tc>
+        <w:tc>
+          <w:tcPr>
+            <w:tcW w:type="dxa" w:w="1568"/>
+          </w:tcPr>
+          <w:p>
+            <w:r>
+              <w:t>588</w:t>
+            </w:r>
+          </w:p>
+        </w:tc>
+        <w:tc>
+          <w:tcPr>
+            <w:tcW w:type="dxa" w:w="1568"/>
+          </w:tcPr>
+          <w:p>
+            <w:r>
+              <w:t>3,224</w:t>
+            </w:r>
+          </w:p>
+        </w:tc>
+      </w:tr>
+    </w:tbl>
+    <w:p>
+      <w:pPr>
+        <w:pStyle w:val="Heading2"/>
+      </w:pPr>
+      <w:r>
+        <w:t>3.3 Skin-tone scales and groups</w:t>
+      </w:r>
+    </w:p>
+    <w:p>
+      <w:pPr>
+        <w:ind w:firstLine="709"/>
+        <w:jc w:val="both"/>
+      </w:pPr>
+      <w:r>
+        <w:t>The Fitzpatrick scale (FST) classifies skin into six types by its reaction to sun: type I (very pale skin) always burns and never tans, type III sometimes burns and tans gradually, and type VI (very dark skin) almost never burns (https://doi.org/10.1001/archderm.1988.01670060015008) [4]. In SCIN, up to three dermatologists assigned each case an FST label from the photographs [3]. We define eFST (estimated Fitzpatrick skin type) as the median of the available labels, rounded half up. eFST is a rater's estimate from a photograph, not a measurement of the skin, and is affected by lighting.</w:t>
+      </w:r>
+    </w:p>
+    <w:p>
+      <w:pPr>
+        <w:ind w:firstLine="709"/>
+        <w:jc w:val="both"/>
+      </w:pPr>
+      <w:r>
+        <w:t>Because single types are sparse (type VI has only 68 cases), we pair them: I–II (lightest skin, 1,773 cases), III–IV (medium skin, 2,161 cases) and V–VI (darkest skin, 436 cases). The 663 cases with no FST label form a separate missing group.</w:t>
+      </w:r>
+    </w:p>
+    <w:p>
+      <w:pPr>
+        <w:ind w:firstLine="709"/>
+        <w:jc w:val="both"/>
+      </w:pPr>
+      <w:r>
+        <w:t>The second scale, eMST (estimated Monk Skin Tone), uses the 10-point Monk scale (https://skintone.google/) [5] as rated by annotators; we group it as 1–3 (light), 4–6 (medium) and 7–10 (dark). eMST is not equivalent to eFST: the two are different measures of skin tone and are reported separately.</w:t>
+      </w:r>
+    </w:p>
+    <w:p>
+      <w:pPr>
+        <w:pStyle w:val="Heading2"/>
+      </w:pPr>
+      <w:r>
+        <w:t>3.4 Questionnaire encoding and missingness mask</w:t>
+      </w:r>
+    </w:p>
+    <w:p>
+      <w:pPr>
+        <w:ind w:firstLine="709"/>
+        <w:jc w:val="both"/>
+      </w:pPr>
+      <w:r>
+        <w:t>Self-reported SCIN answers [3] are encoded as a fixed-length numeric vector plus a binary missingness mask. The mask has one entry per questionnaire field: 1 means the question was not answered and 0 that it was. We do not impute (replace missing values with an estimate such as the mean); a missing field is set to 0 in the vector and the model reads the mask to know that this 0 is not an answer. This allows experiments that drop answers on purpose (modality dropout) and measures robustness to missing answers.</w:t>
+      </w:r>
+    </w:p>
+    <w:p>
+      <w:pPr>
+        <w:ind w:firstLine="709"/>
+        <w:jc w:val="both"/>
+      </w:pPr>
+      <w:r>
+        <w:t>An explicit "unknown" or "none of the above" answer counts as present (mask 0) and has its own indicator column, distinct from a missing answer. Six fields are encoded: age group and self-reported skin type (one-hot: one column per option, exactly one equal to 1), body area, symptoms and texture (multi-hot: one column per option, several can be 1 because respondents may tick more than one) and duration (ordinal: an integer from 1, one day, to 8, since childhood, preserving order). This gives 40 feature columns and 6 mask columns per case_id.</w:t>
+      </w:r>
+    </w:p>
+    <w:p>
+      <w:pPr>
+        <w:ind w:firstLine="709"/>
+        <w:jc w:val="both"/>
+      </w:pPr>
+      <w:r>
+        <w:t>Multi-select questions are stored in SCIN as one column per option holding YES or blank. A blank cell means not ticked, so a question counts as unanswered only when no option is ticked; a respondent who skipped the question cannot be distinguished from one who ticked nothing (a limitation). Observed missing rates are 18.8% for body area, 25.1% for symptoms, 19.0% for texture, 19.8% for duration and 50.3% for skin type, with a further 328 cases answering "none of the above" for skin type. Sex at birth, race/ethnicity, systemic symptoms and the self-described category are excluded: the first two are reserved for fairness analysis and the last contains labels such as "acne" that would leak the target class.</w:t>
+      </w:r>
+    </w:p>
+    <w:p>
+      <w:pPr>
         <w:pStyle w:val="Heading1"/>
       </w:pPr>
       <w:r>
@@ -490,6 +999,22 @@
       </w:pPr>
       <w:r>
         <w:t>[3] Google Research, SCIN dataset schema documentation. https://github.com/google-research-datasets/scin/blob/main/dataset_schema.md</w:t>
+      </w:r>
+    </w:p>
+    <w:p>
+      <w:pPr>
+        <w:ind w:firstLine="0"/>
+      </w:pPr>
+      <w:r>
+        <w:t>[4] T. B. Fitzpatrick, The validity and practicality of sun-reactive skin types I through VI, Archives of Dermatology 124(6), 1988, 869–871. https://doi.org/10.1001/archderm.1988.01670060015008</w:t>
+      </w:r>
+    </w:p>
+    <w:p>
+      <w:pPr>
+        <w:ind w:firstLine="0"/>
+      </w:pPr>
+      <w:r>
+        <w:t>[5] Google Research, Monk Skin Tone Scale. https://skintone.google/</w:t>
       </w:r>
     </w:p>
     <w:sectPr>

</xml_diff>

<commit_message>
docs: add questionnaire encoding section to thesis and paper, journal entry
</commit_message>
<xml_diff>
--- a/docs/Paper_Introduction.docx
+++ b/docs/Paper_Introduction.docx
@@ -936,6 +936,41 @@
     </w:p>
     <w:p>
       <w:pPr>
+        <w:pStyle w:val="Heading2"/>
+      </w:pPr>
+      <w:r>
+        <w:t>3.4 Questionnaire encoding and missingness mask</w:t>
+      </w:r>
+    </w:p>
+    <w:p>
+      <w:pPr>
+        <w:ind w:firstLine="709"/>
+        <w:jc w:val="both"/>
+      </w:pPr>
+      <w:r>
+        <w:t>Self-reported SCIN answers [3] are encoded as a fixed-length numeric vector plus a binary missingness mask. The mask has one entry per questionnaire field: 1 means the question was not answered and 0 that it was. We do not impute (replace missing values with an estimate such as the mean); a missing field is set to 0 in the vector and the model reads the mask to know that this 0 is not an answer. This allows experiments that drop answers on purpose (modality dropout) and measures robustness to missing answers.</w:t>
+      </w:r>
+    </w:p>
+    <w:p>
+      <w:pPr>
+        <w:ind w:firstLine="709"/>
+        <w:jc w:val="both"/>
+      </w:pPr>
+      <w:r>
+        <w:t>An explicit "unknown" or "none of the above" answer counts as present (mask 0) and has its own indicator column, distinct from a missing answer. Six fields are encoded: age group and self-reported skin type (one-hot: one column per option, exactly one equal to 1), body area, symptoms and texture (multi-hot: one column per option, several can be 1 because respondents may tick more than one) and duration (ordinal: an integer from 1, one day, to 8, since childhood, preserving order). This gives 40 feature columns and 6 mask columns per case_id.</w:t>
+      </w:r>
+    </w:p>
+    <w:p>
+      <w:pPr>
+        <w:ind w:firstLine="709"/>
+        <w:jc w:val="both"/>
+      </w:pPr>
+      <w:r>
+        <w:t>Multi-select questions are stored in SCIN as one column per option holding YES or blank. A blank cell means not ticked, so a question counts as unanswered only when no option is ticked; a respondent who skipped the question cannot be distinguished from one who ticked nothing (a limitation). Observed missing rates are 18.8% for body area, 25.1% for symptoms, 19.0% for texture, 19.8% for duration and 50.3% for skin type, with a further 328 cases answering "none of the above" for skin type. Sex at birth, race/ethnicity, systemic symptoms and the self-described category are excluded: the first two are reserved for fairness analysis and the last contains labels such as "acne" that would leak the target class.</w:t>
+      </w:r>
+    </w:p>
+    <w:p>
+      <w:pPr>
         <w:pStyle w:val="Heading1"/>
       </w:pPr>
       <w:r>

</xml_diff>

<commit_message>
feat(ml): add case-level train/val/test splits with leakage tests
Add make_splits.py, which splits SCIN by case_id into 70/15/15 train/val/test
for seeds 0-4, stratified on primary_label x eFST group in two steps with rare
strata merged. Commit the resulting train_val_test_splits.json and
split_summary.csv, plus pytest checks (test_no_leakage.py) that no case_id
overlaps between splits, no duplicates exist and every case is covered.

Document the splitting method in thesis section 5.5 and paper section 3.5, with
a journal entry.
</commit_message>
<xml_diff>
--- a/docs/Paper_Introduction.docx
+++ b/docs/Paper_Introduction.docx
@@ -971,6 +971,41 @@
     </w:p>
     <w:p>
       <w:pPr>
+        <w:pStyle w:val="Heading2"/>
+      </w:pPr>
+      <w:r>
+        <w:t>3.5 Case-level train/validation/test splits</w:t>
+      </w:r>
+    </w:p>
+    <w:p>
+      <w:pPr>
+        <w:ind w:firstLine="709"/>
+        <w:jc w:val="both"/>
+      </w:pPr>
+      <w:r>
+        <w:t>We split the data into train (70%, where the model learns), validation (15%, for choosing settings) and test (15%, used only for final evaluation). The split is made at the case level (case_id), not the image level: all photographs of a case stay in one split. Otherwise data leakage occurs: the model would see one photo of a case during training and be tested on another photo of the same case, inflating the results. The script (ml/splits/make_splits.py) works on one row per case_id, so a case cannot be divided between splits.</w:t>
+      </w:r>
+    </w:p>
+    <w:p>
+      <w:pPr>
+        <w:ind w:firstLine="709"/>
+        <w:jc w:val="both"/>
+      </w:pPr>
+      <w:r>
+        <w:t>The split is stratified, meaning each split keeps roughly the same proportions of a combined variable: target category (primary_label) times eFST group (I-II, III-IV, V-VI or missing), so darker skin tones do not end up in a single split by chance. It is done in two steps: 70% train versus 30% rest, then the rest is halved into validation and test. Combinations with fewer than 4 cases cannot be stratified; they are merged first by category and then into one shared group (5 cases in total). The procedure is repeated for five seeds (0-4), the numbers that fix the randomness, which gives five different reproducible splits for reporting the variability of results.</w:t>
+      </w:r>
+    </w:p>
+    <w:p>
+      <w:pPr>
+        <w:ind w:firstLine="709"/>
+        <w:jc w:val="both"/>
+      </w:pPr>
+      <w:r>
+        <w:t>Each seed yields 3,523 train, 755 validation and 755 test cases. In eFST V-VI the cases split 305, 66 and 65. The redness_rosacea category has 44 cases in total (31, 7 and 6 for seed 0) and only one case in V-VI, in the training split, so its per-tone performance cannot be evaluated. An automated test (ml/tests/test_no_leakage.py) checks for every seed that no case_id appears in two splits, that there are no duplicates and that the splits cover every case.</w:t>
+      </w:r>
+    </w:p>
+    <w:p>
+      <w:pPr>
         <w:pStyle w:val="Heading1"/>
       </w:pPr>
       <w:r>

</xml_diff>